<commit_message>
update Lab 9 Answers
</commit_message>
<xml_diff>
--- a/Codes and Projects/Servicenow development/Day 9 Lab/Day 9 Lab Answers.docx
+++ b/Codes and Projects/Servicenow development/Day 9 Lab/Day 9 Lab Answers.docx
@@ -436,19 +436,6 @@
         </w:drawing>
       </w:r>
     </w:p>
-    <w:p/>
-    <w:p/>
-    <w:p/>
-    <w:p/>
-    <w:p/>
-    <w:p>
-      <w:r>
-        <w:br/>
-      </w:r>
-    </w:p>
-    <w:p/>
-    <w:p/>
-    <w:p/>
     <w:sectPr>
       <w:footerReference w:type="default" r:id="rId13"/>
       <w:pgSz w:w="12240" w:h="15840"/>

</xml_diff>

<commit_message>
Update Day 9 Lab
Pending some task will be done By the end of the Day
</commit_message>
<xml_diff>
--- a/Codes and Projects/Servicenow development/Day 9 Lab/Day 9 Lab Answers.docx
+++ b/Codes and Projects/Servicenow development/Day 9 Lab/Day 9 Lab Answers.docx
@@ -212,6 +212,194 @@
         <w:t xml:space="preserve"> Tasks (3,11)</w:t>
       </w:r>
     </w:p>
+    <w:p/>
+    <w:p/>
+    <w:p>
+      <w:r>
+        <w:rPr>
+          <w:noProof/>
+        </w:rPr>
+        <w:drawing>
+          <wp:inline distT="0" distB="0" distL="0" distR="0" wp14:anchorId="05E23F95" wp14:editId="0967DAEB">
+            <wp:extent cx="6858000" cy="3684270"/>
+            <wp:effectExtent l="0" t="0" r="0" b="0"/>
+            <wp:docPr id="1913944047" name="Picture 1"/>
+            <wp:cNvGraphicFramePr>
+              <a:graphicFrameLocks xmlns:a="http://schemas.openxmlformats.org/drawingml/2006/main" noChangeAspect="1"/>
+            </wp:cNvGraphicFramePr>
+            <a:graphic xmlns:a="http://schemas.openxmlformats.org/drawingml/2006/main">
+              <a:graphicData uri="http://schemas.openxmlformats.org/drawingml/2006/picture">
+                <pic:pic xmlns:pic="http://schemas.openxmlformats.org/drawingml/2006/picture">
+                  <pic:nvPicPr>
+                    <pic:cNvPr id="1913944047" name=""/>
+                    <pic:cNvPicPr/>
+                  </pic:nvPicPr>
+                  <pic:blipFill>
+                    <a:blip r:embed="rId10"/>
+                    <a:stretch>
+                      <a:fillRect/>
+                    </a:stretch>
+                  </pic:blipFill>
+                  <pic:spPr>
+                    <a:xfrm>
+                      <a:off x="0" y="0"/>
+                      <a:ext cx="6858000" cy="3684270"/>
+                    </a:xfrm>
+                    <a:prstGeom prst="rect">
+                      <a:avLst/>
+                    </a:prstGeom>
+                  </pic:spPr>
+                </pic:pic>
+              </a:graphicData>
+            </a:graphic>
+          </wp:inline>
+        </w:drawing>
+      </w:r>
+    </w:p>
+    <w:p>
+      <w:r>
+        <w:t>Business rule before</w:t>
+      </w:r>
+    </w:p>
+    <w:p>
+      <w:r>
+        <w:t>27-50-44-31</w:t>
+      </w:r>
+    </w:p>
+    <w:p/>
+    <w:p/>
+    <w:p>
+      <w:pPr>
+        <w:rPr>
+          <w:noProof/>
+        </w:rPr>
+      </w:pPr>
+    </w:p>
+    <w:p>
+      <w:r>
+        <w:rPr>
+          <w:noProof/>
+        </w:rPr>
+        <w:drawing>
+          <wp:inline distT="0" distB="0" distL="0" distR="0" wp14:anchorId="5ADF2796" wp14:editId="1288F712">
+            <wp:extent cx="6858000" cy="1695450"/>
+            <wp:effectExtent l="0" t="0" r="0" b="0"/>
+            <wp:docPr id="74434324" name="Picture 3"/>
+            <wp:cNvGraphicFramePr>
+              <a:graphicFrameLocks xmlns:a="http://schemas.openxmlformats.org/drawingml/2006/main" noChangeAspect="1"/>
+            </wp:cNvGraphicFramePr>
+            <a:graphic xmlns:a="http://schemas.openxmlformats.org/drawingml/2006/main">
+              <a:graphicData uri="http://schemas.openxmlformats.org/drawingml/2006/picture">
+                <pic:pic xmlns:pic="http://schemas.openxmlformats.org/drawingml/2006/picture">
+                  <pic:nvPicPr>
+                    <pic:cNvPr id="0" name="Picture 11"/>
+                    <pic:cNvPicPr>
+                      <a:picLocks noChangeAspect="1" noChangeArrowheads="1"/>
+                    </pic:cNvPicPr>
+                  </pic:nvPicPr>
+                  <pic:blipFill rotWithShape="1">
+                    <a:blip r:embed="rId11">
+                      <a:extLst>
+                        <a:ext uri="{28A0092B-C50C-407E-A947-70E740481C1C}">
+                          <a14:useLocalDpi xmlns:a14="http://schemas.microsoft.com/office/drawing/2010/main" val="0"/>
+                        </a:ext>
+                      </a:extLst>
+                    </a:blip>
+                    <a:srcRect b="44329"/>
+                    <a:stretch>
+                      <a:fillRect/>
+                    </a:stretch>
+                  </pic:blipFill>
+                  <pic:spPr bwMode="auto">
+                    <a:xfrm>
+                      <a:off x="0" y="0"/>
+                      <a:ext cx="6858000" cy="1695450"/>
+                    </a:xfrm>
+                    <a:prstGeom prst="rect">
+                      <a:avLst/>
+                    </a:prstGeom>
+                    <a:noFill/>
+                    <a:ln>
+                      <a:noFill/>
+                    </a:ln>
+                    <a:extLst>
+                      <a:ext uri="{53640926-AAD7-44D8-BBD7-CCE9431645EC}">
+                        <a14:shadowObscured xmlns:a14="http://schemas.microsoft.com/office/drawing/2010/main"/>
+                      </a:ext>
+                    </a:extLst>
+                  </pic:spPr>
+                </pic:pic>
+              </a:graphicData>
+            </a:graphic>
+          </wp:inline>
+        </w:drawing>
+      </w:r>
+    </w:p>
+    <w:p>
+      <w:r>
+        <w:rPr>
+          <w:noProof/>
+        </w:rPr>
+        <w:drawing>
+          <wp:inline distT="0" distB="0" distL="0" distR="0" wp14:anchorId="0D0B3134" wp14:editId="6F48896E">
+            <wp:extent cx="6858000" cy="3186430"/>
+            <wp:effectExtent l="0" t="0" r="0" b="0"/>
+            <wp:docPr id="946959714" name="Picture 4"/>
+            <wp:cNvGraphicFramePr>
+              <a:graphicFrameLocks xmlns:a="http://schemas.openxmlformats.org/drawingml/2006/main" noChangeAspect="1"/>
+            </wp:cNvGraphicFramePr>
+            <a:graphic xmlns:a="http://schemas.openxmlformats.org/drawingml/2006/main">
+              <a:graphicData uri="http://schemas.openxmlformats.org/drawingml/2006/picture">
+                <pic:pic xmlns:pic="http://schemas.openxmlformats.org/drawingml/2006/picture">
+                  <pic:nvPicPr>
+                    <pic:cNvPr id="0" name="Picture 13"/>
+                    <pic:cNvPicPr>
+                      <a:picLocks noChangeAspect="1" noChangeArrowheads="1"/>
+                    </pic:cNvPicPr>
+                  </pic:nvPicPr>
+                  <pic:blipFill>
+                    <a:blip r:embed="rId12">
+                      <a:extLst>
+                        <a:ext uri="{28A0092B-C50C-407E-A947-70E740481C1C}">
+                          <a14:useLocalDpi xmlns:a14="http://schemas.microsoft.com/office/drawing/2010/main" val="0"/>
+                        </a:ext>
+                      </a:extLst>
+                    </a:blip>
+                    <a:srcRect/>
+                    <a:stretch>
+                      <a:fillRect/>
+                    </a:stretch>
+                  </pic:blipFill>
+                  <pic:spPr bwMode="auto">
+                    <a:xfrm>
+                      <a:off x="0" y="0"/>
+                      <a:ext cx="6858000" cy="3186430"/>
+                    </a:xfrm>
+                    <a:prstGeom prst="rect">
+                      <a:avLst/>
+                    </a:prstGeom>
+                    <a:noFill/>
+                    <a:ln>
+                      <a:noFill/>
+                    </a:ln>
+                  </pic:spPr>
+                </pic:pic>
+              </a:graphicData>
+            </a:graphic>
+          </wp:inline>
+        </w:drawing>
+      </w:r>
+    </w:p>
+    <w:p>
+      <w:r>
+        <w:t>Business rule after</w:t>
+      </w:r>
+    </w:p>
+    <w:p>
+      <w:r>
+        <w:t>28-47-36-45</w:t>
+      </w:r>
+    </w:p>
     <w:p>
       <w:pPr>
         <w:pStyle w:val="Heading2"/>
@@ -222,6 +410,7 @@
         </w:rPr>
       </w:pPr>
       <w:r>
+        <w:lastRenderedPageBreak/>
         <w:t xml:space="preserve">Answers Task </w:t>
       </w:r>
       <w:r>
@@ -250,6 +439,9 @@
         <w:br/>
       </w:r>
       <w:r>
+        <w:rPr>
+          <w:noProof/>
+        </w:rPr>
         <w:drawing>
           <wp:inline distT="0" distB="0" distL="0" distR="0" wp14:anchorId="24460B85" wp14:editId="18F082FC">
             <wp:extent cx="6858000" cy="2750185"/>
@@ -266,7 +458,7 @@
                     <pic:cNvPicPr/>
                   </pic:nvPicPr>
                   <pic:blipFill>
-                    <a:blip r:embed="rId10"/>
+                    <a:blip r:embed="rId13"/>
                     <a:stretch>
                       <a:fillRect/>
                     </a:stretch>
@@ -288,21 +480,12 @@
       </w:r>
     </w:p>
     <w:p/>
-    <w:p/>
-    <w:p/>
-    <w:p/>
-    <w:p/>
-    <w:p/>
     <w:p>
       <w:pPr>
         <w:pStyle w:val="Heading2"/>
       </w:pPr>
       <w:r>
-        <w:lastRenderedPageBreak/>
-        <w:t>Answers Task</w:t>
-      </w:r>
-      <w:r>
-        <w:t xml:space="preserve"> </w:t>
+        <w:t xml:space="preserve">Answers Task </w:t>
       </w:r>
       <w:r>
         <w:t>22</w:t>
@@ -330,6 +513,9 @@
         <w:br/>
       </w:r>
       <w:r>
+        <w:rPr>
+          <w:noProof/>
+        </w:rPr>
         <w:drawing>
           <wp:inline distT="0" distB="0" distL="0" distR="0" wp14:anchorId="5824CD2E" wp14:editId="7E9C4328">
             <wp:extent cx="6858000" cy="2492375"/>
@@ -346,7 +532,7 @@
                     <pic:cNvPicPr/>
                   </pic:nvPicPr>
                   <pic:blipFill>
-                    <a:blip r:embed="rId11"/>
+                    <a:blip r:embed="rId14"/>
                     <a:stretch>
                       <a:fillRect/>
                     </a:stretch>
@@ -372,13 +558,8 @@
         <w:pStyle w:val="Heading2"/>
       </w:pPr>
       <w:r>
-        <w:t>Answers Task 2</w:t>
-      </w:r>
-      <w:r>
-        <w:t>4</w:t>
-      </w:r>
-      <w:r>
-        <w:t>:</w:t>
+        <w:lastRenderedPageBreak/>
+        <w:t>Answers Task 24:</w:t>
       </w:r>
     </w:p>
     <w:p>
@@ -399,6 +580,9 @@
     </w:p>
     <w:p>
       <w:r>
+        <w:rPr>
+          <w:noProof/>
+        </w:rPr>
         <w:drawing>
           <wp:inline distT="0" distB="0" distL="0" distR="0" wp14:anchorId="65914873" wp14:editId="3902C53F">
             <wp:extent cx="6858000" cy="2839720"/>
@@ -415,7 +599,7 @@
                     <pic:cNvPicPr/>
                   </pic:nvPicPr>
                   <pic:blipFill>
-                    <a:blip r:embed="rId12"/>
+                    <a:blip r:embed="rId15"/>
                     <a:stretch>
                       <a:fillRect/>
                     </a:stretch>
@@ -436,8 +620,568 @@
         </w:drawing>
       </w:r>
     </w:p>
+    <w:p>
+      <w:pPr>
+        <w:pStyle w:val="Heading2"/>
+      </w:pPr>
+      <w:r>
+        <w:t>Answers Task 2</w:t>
+      </w:r>
+      <w:r>
+        <w:t>7</w:t>
+      </w:r>
+      <w:r>
+        <w:t>:</w:t>
+      </w:r>
+    </w:p>
+    <w:p>
+      <w:r>
+        <w:t>Calculate Incident Priority on the server - Incident - Easy</w:t>
+      </w:r>
+      <w:r>
+        <w:t xml:space="preserve"> </w:t>
+      </w:r>
+      <w:r>
+        <w:t>(</w:t>
+      </w:r>
+      <w:r>
+        <w:t>Business Rule - Before</w:t>
+      </w:r>
+      <w:r>
+        <w:t>)</w:t>
+      </w:r>
+    </w:p>
+    <w:p>
+      <w:r>
+        <w:drawing>
+          <wp:inline distT="0" distB="0" distL="0" distR="0" wp14:anchorId="6D34BF80" wp14:editId="00BDD78C">
+            <wp:extent cx="6098650" cy="3239625"/>
+            <wp:effectExtent l="0" t="0" r="0" b="0"/>
+            <wp:docPr id="1838780635" name="Picture 1"/>
+            <wp:cNvGraphicFramePr>
+              <a:graphicFrameLocks xmlns:a="http://schemas.openxmlformats.org/drawingml/2006/main" noChangeAspect="1"/>
+            </wp:cNvGraphicFramePr>
+            <a:graphic xmlns:a="http://schemas.openxmlformats.org/drawingml/2006/main">
+              <a:graphicData uri="http://schemas.openxmlformats.org/drawingml/2006/picture">
+                <pic:pic xmlns:pic="http://schemas.openxmlformats.org/drawingml/2006/picture">
+                  <pic:nvPicPr>
+                    <pic:cNvPr id="1838780635" name=""/>
+                    <pic:cNvPicPr/>
+                  </pic:nvPicPr>
+                  <pic:blipFill>
+                    <a:blip r:embed="rId16"/>
+                    <a:stretch>
+                      <a:fillRect/>
+                    </a:stretch>
+                  </pic:blipFill>
+                  <pic:spPr>
+                    <a:xfrm>
+                      <a:off x="0" y="0"/>
+                      <a:ext cx="6104522" cy="3242744"/>
+                    </a:xfrm>
+                    <a:prstGeom prst="rect">
+                      <a:avLst/>
+                    </a:prstGeom>
+                  </pic:spPr>
+                </pic:pic>
+              </a:graphicData>
+            </a:graphic>
+          </wp:inline>
+        </w:drawing>
+      </w:r>
+    </w:p>
+    <w:p>
+      <w:pPr>
+        <w:pStyle w:val="Heading2"/>
+      </w:pPr>
+      <w:r>
+        <w:lastRenderedPageBreak/>
+        <w:t xml:space="preserve">Answers Task </w:t>
+      </w:r>
+      <w:r>
+        <w:t>50</w:t>
+      </w:r>
+      <w:r>
+        <w:t>:</w:t>
+      </w:r>
+    </w:p>
+    <w:p>
+      <w:r>
+        <w:t>Set Opened By to current user if left blank - Incident - Easy</w:t>
+      </w:r>
+      <w:r>
+        <w:t xml:space="preserve"> </w:t>
+      </w:r>
+      <w:r>
+        <w:t>(Business Rule - Before)</w:t>
+      </w:r>
+    </w:p>
+    <w:p>
+      <w:r>
+        <w:drawing>
+          <wp:inline distT="0" distB="0" distL="0" distR="0" wp14:anchorId="5B3BBD82" wp14:editId="3F4A479E">
+            <wp:extent cx="6858000" cy="2315845"/>
+            <wp:effectExtent l="0" t="0" r="0" b="8255"/>
+            <wp:docPr id="1040658524" name="Picture 1"/>
+            <wp:cNvGraphicFramePr>
+              <a:graphicFrameLocks xmlns:a="http://schemas.openxmlformats.org/drawingml/2006/main" noChangeAspect="1"/>
+            </wp:cNvGraphicFramePr>
+            <a:graphic xmlns:a="http://schemas.openxmlformats.org/drawingml/2006/main">
+              <a:graphicData uri="http://schemas.openxmlformats.org/drawingml/2006/picture">
+                <pic:pic xmlns:pic="http://schemas.openxmlformats.org/drawingml/2006/picture">
+                  <pic:nvPicPr>
+                    <pic:cNvPr id="1040658524" name=""/>
+                    <pic:cNvPicPr/>
+                  </pic:nvPicPr>
+                  <pic:blipFill>
+                    <a:blip r:embed="rId17"/>
+                    <a:stretch>
+                      <a:fillRect/>
+                    </a:stretch>
+                  </pic:blipFill>
+                  <pic:spPr>
+                    <a:xfrm>
+                      <a:off x="0" y="0"/>
+                      <a:ext cx="6858000" cy="2315845"/>
+                    </a:xfrm>
+                    <a:prstGeom prst="rect">
+                      <a:avLst/>
+                    </a:prstGeom>
+                  </pic:spPr>
+                </pic:pic>
+              </a:graphicData>
+            </a:graphic>
+          </wp:inline>
+        </w:drawing>
+      </w:r>
+    </w:p>
+    <w:p>
+      <w:pPr>
+        <w:pStyle w:val="Heading2"/>
+      </w:pPr>
+      <w:r>
+        <w:t xml:space="preserve">Answers Task </w:t>
+      </w:r>
+      <w:r>
+        <w:t>44</w:t>
+      </w:r>
+      <w:r>
+        <w:t>:</w:t>
+      </w:r>
+    </w:p>
+    <w:p>
+      <w:r>
+        <w:t xml:space="preserve">Force Knowledge article to Draft on insert - Knowledge </w:t>
+      </w:r>
+      <w:r>
+        <w:t>–</w:t>
+      </w:r>
+      <w:r>
+        <w:t xml:space="preserve"> Easy</w:t>
+      </w:r>
+      <w:r>
+        <w:t xml:space="preserve"> </w:t>
+      </w:r>
+      <w:r>
+        <w:t>(Business Rule - Before)</w:t>
+      </w:r>
+      <w:r>
+        <w:br/>
+      </w:r>
+      <w:r>
+        <w:drawing>
+          <wp:inline distT="0" distB="0" distL="0" distR="0" wp14:anchorId="197570D9" wp14:editId="353BA54A">
+            <wp:extent cx="6858000" cy="2101850"/>
+            <wp:effectExtent l="0" t="0" r="0" b="0"/>
+            <wp:docPr id="212881506" name="Picture 1"/>
+            <wp:cNvGraphicFramePr>
+              <a:graphicFrameLocks xmlns:a="http://schemas.openxmlformats.org/drawingml/2006/main" noChangeAspect="1"/>
+            </wp:cNvGraphicFramePr>
+            <a:graphic xmlns:a="http://schemas.openxmlformats.org/drawingml/2006/main">
+              <a:graphicData uri="http://schemas.openxmlformats.org/drawingml/2006/picture">
+                <pic:pic xmlns:pic="http://schemas.openxmlformats.org/drawingml/2006/picture">
+                  <pic:nvPicPr>
+                    <pic:cNvPr id="212881506" name=""/>
+                    <pic:cNvPicPr/>
+                  </pic:nvPicPr>
+                  <pic:blipFill>
+                    <a:blip r:embed="rId18"/>
+                    <a:stretch>
+                      <a:fillRect/>
+                    </a:stretch>
+                  </pic:blipFill>
+                  <pic:spPr>
+                    <a:xfrm>
+                      <a:off x="0" y="0"/>
+                      <a:ext cx="6858000" cy="2101850"/>
+                    </a:xfrm>
+                    <a:prstGeom prst="rect">
+                      <a:avLst/>
+                    </a:prstGeom>
+                  </pic:spPr>
+                </pic:pic>
+              </a:graphicData>
+            </a:graphic>
+          </wp:inline>
+        </w:drawing>
+      </w:r>
+    </w:p>
+    <w:p/>
+    <w:p/>
+    <w:p/>
+    <w:p/>
+    <w:p/>
+    <w:p>
+      <w:pPr>
+        <w:pStyle w:val="Heading2"/>
+      </w:pPr>
+      <w:r>
+        <w:lastRenderedPageBreak/>
+        <w:t xml:space="preserve">Answers Task </w:t>
+      </w:r>
+      <w:r>
+        <w:t>31</w:t>
+      </w:r>
+      <w:r>
+        <w:t>:</w:t>
+      </w:r>
+    </w:p>
+    <w:p>
+      <w:r>
+        <w:t xml:space="preserve"> Set Knowledge Published date when article is published - Knowledge </w:t>
+      </w:r>
+      <w:r>
+        <w:t>–</w:t>
+      </w:r>
+      <w:r>
+        <w:t xml:space="preserve"> </w:t>
+      </w:r>
+      <w:r>
+        <w:t>Easy</w:t>
+      </w:r>
+      <w:r>
+        <w:t xml:space="preserve"> (Business Rule - Before)</w:t>
+      </w:r>
+    </w:p>
+    <w:p>
+      <w:r>
+        <w:drawing>
+          <wp:inline distT="0" distB="0" distL="0" distR="0" wp14:anchorId="628F5D7E" wp14:editId="347DA5F1">
+            <wp:extent cx="6858000" cy="2124710"/>
+            <wp:effectExtent l="0" t="0" r="0" b="8890"/>
+            <wp:docPr id="2098044174" name="Picture 1"/>
+            <wp:cNvGraphicFramePr>
+              <a:graphicFrameLocks xmlns:a="http://schemas.openxmlformats.org/drawingml/2006/main" noChangeAspect="1"/>
+            </wp:cNvGraphicFramePr>
+            <a:graphic xmlns:a="http://schemas.openxmlformats.org/drawingml/2006/main">
+              <a:graphicData uri="http://schemas.openxmlformats.org/drawingml/2006/picture">
+                <pic:pic xmlns:pic="http://schemas.openxmlformats.org/drawingml/2006/picture">
+                  <pic:nvPicPr>
+                    <pic:cNvPr id="2098044174" name=""/>
+                    <pic:cNvPicPr/>
+                  </pic:nvPicPr>
+                  <pic:blipFill>
+                    <a:blip r:embed="rId19"/>
+                    <a:stretch>
+                      <a:fillRect/>
+                    </a:stretch>
+                  </pic:blipFill>
+                  <pic:spPr>
+                    <a:xfrm>
+                      <a:off x="0" y="0"/>
+                      <a:ext cx="6858000" cy="2124710"/>
+                    </a:xfrm>
+                    <a:prstGeom prst="rect">
+                      <a:avLst/>
+                    </a:prstGeom>
+                  </pic:spPr>
+                </pic:pic>
+              </a:graphicData>
+            </a:graphic>
+          </wp:inline>
+        </w:drawing>
+      </w:r>
+    </w:p>
+    <w:p>
+      <w:pPr>
+        <w:pStyle w:val="Heading2"/>
+      </w:pPr>
+      <w:r>
+        <w:t xml:space="preserve">Answers Task </w:t>
+      </w:r>
+      <w:r>
+        <w:t>28</w:t>
+      </w:r>
+      <w:r>
+        <w:t>:</w:t>
+      </w:r>
+    </w:p>
+    <w:p>
+      <w:r>
+        <w:t xml:space="preserve"> </w:t>
+      </w:r>
+      <w:r>
+        <w:t>Create Problem after repeated active Incidents on same CI - Incident - Intermediate</w:t>
+      </w:r>
+      <w:r>
+        <w:t xml:space="preserve"> </w:t>
+      </w:r>
+      <w:r>
+        <w:t xml:space="preserve">(Business Rule - </w:t>
+      </w:r>
+      <w:r>
+        <w:t>after</w:t>
+      </w:r>
+      <w:r>
+        <w:t>)</w:t>
+      </w:r>
+    </w:p>
+    <w:p>
+      <w:r>
+        <w:drawing>
+          <wp:inline distT="0" distB="0" distL="0" distR="0" wp14:anchorId="2F741B82" wp14:editId="46E9B3BF">
+            <wp:extent cx="6858000" cy="3602990"/>
+            <wp:effectExtent l="0" t="0" r="0" b="0"/>
+            <wp:docPr id="1354889765" name="Picture 1"/>
+            <wp:cNvGraphicFramePr>
+              <a:graphicFrameLocks xmlns:a="http://schemas.openxmlformats.org/drawingml/2006/main" noChangeAspect="1"/>
+            </wp:cNvGraphicFramePr>
+            <a:graphic xmlns:a="http://schemas.openxmlformats.org/drawingml/2006/main">
+              <a:graphicData uri="http://schemas.openxmlformats.org/drawingml/2006/picture">
+                <pic:pic xmlns:pic="http://schemas.openxmlformats.org/drawingml/2006/picture">
+                  <pic:nvPicPr>
+                    <pic:cNvPr id="1354889765" name=""/>
+                    <pic:cNvPicPr/>
+                  </pic:nvPicPr>
+                  <pic:blipFill>
+                    <a:blip r:embed="rId20"/>
+                    <a:stretch>
+                      <a:fillRect/>
+                    </a:stretch>
+                  </pic:blipFill>
+                  <pic:spPr>
+                    <a:xfrm>
+                      <a:off x="0" y="0"/>
+                      <a:ext cx="6858000" cy="3602990"/>
+                    </a:xfrm>
+                    <a:prstGeom prst="rect">
+                      <a:avLst/>
+                    </a:prstGeom>
+                  </pic:spPr>
+                </pic:pic>
+              </a:graphicData>
+            </a:graphic>
+          </wp:inline>
+        </w:drawing>
+      </w:r>
+    </w:p>
+    <w:p/>
+    <w:p>
+      <w:pPr>
+        <w:pStyle w:val="Heading2"/>
+      </w:pPr>
+      <w:r>
+        <w:lastRenderedPageBreak/>
+        <w:t xml:space="preserve">Answers Task </w:t>
+      </w:r>
+      <w:r>
+        <w:t>47</w:t>
+      </w:r>
+      <w:r>
+        <w:t>:</w:t>
+      </w:r>
+    </w:p>
+    <w:p>
+      <w:r>
+        <w:t>Assign Network Incidents to Network group automatically - Incident - Easy</w:t>
+      </w:r>
+      <w:r>
+        <w:t xml:space="preserve"> </w:t>
+      </w:r>
+      <w:r>
+        <w:t xml:space="preserve">(Business Rule - </w:t>
+      </w:r>
+      <w:r>
+        <w:t>after</w:t>
+      </w:r>
+      <w:r>
+        <w:t>)</w:t>
+      </w:r>
+    </w:p>
+    <w:p>
+      <w:r>
+        <w:drawing>
+          <wp:inline distT="0" distB="0" distL="0" distR="0" wp14:anchorId="71FFCB89" wp14:editId="09429683">
+            <wp:extent cx="6858000" cy="2418080"/>
+            <wp:effectExtent l="0" t="0" r="0" b="1270"/>
+            <wp:docPr id="1787195803" name="Picture 1"/>
+            <wp:cNvGraphicFramePr>
+              <a:graphicFrameLocks xmlns:a="http://schemas.openxmlformats.org/drawingml/2006/main" noChangeAspect="1"/>
+            </wp:cNvGraphicFramePr>
+            <a:graphic xmlns:a="http://schemas.openxmlformats.org/drawingml/2006/main">
+              <a:graphicData uri="http://schemas.openxmlformats.org/drawingml/2006/picture">
+                <pic:pic xmlns:pic="http://schemas.openxmlformats.org/drawingml/2006/picture">
+                  <pic:nvPicPr>
+                    <pic:cNvPr id="1787195803" name=""/>
+                    <pic:cNvPicPr/>
+                  </pic:nvPicPr>
+                  <pic:blipFill>
+                    <a:blip r:embed="rId21"/>
+                    <a:stretch>
+                      <a:fillRect/>
+                    </a:stretch>
+                  </pic:blipFill>
+                  <pic:spPr>
+                    <a:xfrm>
+                      <a:off x="0" y="0"/>
+                      <a:ext cx="6858000" cy="2418080"/>
+                    </a:xfrm>
+                    <a:prstGeom prst="rect">
+                      <a:avLst/>
+                    </a:prstGeom>
+                  </pic:spPr>
+                </pic:pic>
+              </a:graphicData>
+            </a:graphic>
+          </wp:inline>
+        </w:drawing>
+      </w:r>
+    </w:p>
+    <w:p/>
+    <w:p>
+      <w:pPr>
+        <w:pStyle w:val="Heading2"/>
+      </w:pPr>
+      <w:r>
+        <w:t xml:space="preserve">Answers Task </w:t>
+      </w:r>
+      <w:r>
+        <w:t>36</w:t>
+      </w:r>
+      <w:r>
+        <w:t>:</w:t>
+      </w:r>
+    </w:p>
+    <w:p>
+      <w:r>
+        <w:t>Close child Incidents when parent is closed - Incident - Intermediate</w:t>
+      </w:r>
+      <w:r>
+        <w:t xml:space="preserve"> </w:t>
+      </w:r>
+      <w:r>
+        <w:t>(Business Rule - after)</w:t>
+      </w:r>
+    </w:p>
+    <w:p>
+      <w:r>
+        <w:drawing>
+          <wp:inline distT="0" distB="0" distL="0" distR="0" wp14:anchorId="0F9B8491" wp14:editId="57E93AF4">
+            <wp:extent cx="6858000" cy="2793365"/>
+            <wp:effectExtent l="0" t="0" r="0" b="6985"/>
+            <wp:docPr id="1180361443" name="Picture 1"/>
+            <wp:cNvGraphicFramePr>
+              <a:graphicFrameLocks xmlns:a="http://schemas.openxmlformats.org/drawingml/2006/main" noChangeAspect="1"/>
+            </wp:cNvGraphicFramePr>
+            <a:graphic xmlns:a="http://schemas.openxmlformats.org/drawingml/2006/main">
+              <a:graphicData uri="http://schemas.openxmlformats.org/drawingml/2006/picture">
+                <pic:pic xmlns:pic="http://schemas.openxmlformats.org/drawingml/2006/picture">
+                  <pic:nvPicPr>
+                    <pic:cNvPr id="1180361443" name=""/>
+                    <pic:cNvPicPr/>
+                  </pic:nvPicPr>
+                  <pic:blipFill>
+                    <a:blip r:embed="rId22"/>
+                    <a:stretch>
+                      <a:fillRect/>
+                    </a:stretch>
+                  </pic:blipFill>
+                  <pic:spPr>
+                    <a:xfrm>
+                      <a:off x="0" y="0"/>
+                      <a:ext cx="6858000" cy="2793365"/>
+                    </a:xfrm>
+                    <a:prstGeom prst="rect">
+                      <a:avLst/>
+                    </a:prstGeom>
+                  </pic:spPr>
+                </pic:pic>
+              </a:graphicData>
+            </a:graphic>
+          </wp:inline>
+        </w:drawing>
+      </w:r>
+    </w:p>
+    <w:p/>
+    <w:p/>
+    <w:p>
+      <w:pPr>
+        <w:pStyle w:val="Heading2"/>
+      </w:pPr>
+      <w:r>
+        <w:lastRenderedPageBreak/>
+        <w:t xml:space="preserve">Answers Task </w:t>
+      </w:r>
+      <w:r>
+        <w:t>45</w:t>
+      </w:r>
+      <w:r>
+        <w:t>:</w:t>
+      </w:r>
+    </w:p>
+    <w:p>
+      <w:r>
+        <w:t>Create review Task when Incident is reassigned three times - Incident - Intermediate</w:t>
+      </w:r>
+      <w:r>
+        <w:t xml:space="preserve"> </w:t>
+      </w:r>
+      <w:r>
+        <w:t>(Business Rule - after)</w:t>
+      </w:r>
+    </w:p>
+    <w:p>
+      <w:r>
+        <w:drawing>
+          <wp:inline distT="0" distB="0" distL="0" distR="0" wp14:anchorId="70A3BFD1" wp14:editId="59F5954E">
+            <wp:extent cx="6858000" cy="2580640"/>
+            <wp:effectExtent l="0" t="0" r="0" b="0"/>
+            <wp:docPr id="1472993478" name="Picture 1"/>
+            <wp:cNvGraphicFramePr>
+              <a:graphicFrameLocks xmlns:a="http://schemas.openxmlformats.org/drawingml/2006/main" noChangeAspect="1"/>
+            </wp:cNvGraphicFramePr>
+            <a:graphic xmlns:a="http://schemas.openxmlformats.org/drawingml/2006/main">
+              <a:graphicData uri="http://schemas.openxmlformats.org/drawingml/2006/picture">
+                <pic:pic xmlns:pic="http://schemas.openxmlformats.org/drawingml/2006/picture">
+                  <pic:nvPicPr>
+                    <pic:cNvPr id="1472993478" name=""/>
+                    <pic:cNvPicPr/>
+                  </pic:nvPicPr>
+                  <pic:blipFill>
+                    <a:blip r:embed="rId23"/>
+                    <a:stretch>
+                      <a:fillRect/>
+                    </a:stretch>
+                  </pic:blipFill>
+                  <pic:spPr>
+                    <a:xfrm>
+                      <a:off x="0" y="0"/>
+                      <a:ext cx="6858000" cy="2580640"/>
+                    </a:xfrm>
+                    <a:prstGeom prst="rect">
+                      <a:avLst/>
+                    </a:prstGeom>
+                  </pic:spPr>
+                </pic:pic>
+              </a:graphicData>
+            </a:graphic>
+          </wp:inline>
+        </w:drawing>
+      </w:r>
+    </w:p>
+    <w:p/>
     <w:sectPr>
-      <w:footerReference w:type="default" r:id="rId13"/>
+      <w:footerReference w:type="default" r:id="rId24"/>
       <w:pgSz w:w="12240" w:h="15840"/>
       <w:pgMar w:top="720" w:right="720" w:bottom="720" w:left="720" w:header="720" w:footer="792" w:gutter="0"/>
       <w:cols w:space="720"/>
@@ -1885,7 +2629,7 @@
   <w:style w:type="paragraph" w:default="1" w:styleId="Normal">
     <w:name w:val="Normal"/>
     <w:qFormat/>
-    <w:rsid w:val="000D7579"/>
+    <w:rsid w:val="008956CF"/>
   </w:style>
   <w:style w:type="paragraph" w:styleId="Heading1">
     <w:name w:val="heading 1"/>

</xml_diff>